<commit_message>
feat(docx): 213/213 locked corpus with zero generic paths
</commit_message>
<xml_diff>
--- a/storage/templates/normalized-docx/BM-167/BM-167_normalized.docx
+++ b/storage/templates/normalized-docx/BM-167/BM-167_normalized.docx
@@ -1123,7 +1123,7 @@
                 <w:szCs w:val="28"/>
                 <w:lang w:val="en-US" w:eastAsia="en-US"/>
               </w:rPr>
-              <w:t>{{document.field}}</w:t>
+              <w:t>{{document.fullDocumentCode2}</w:t>
             </w:r>
           </w:p>
           <w:p>
@@ -1566,7 +1566,7 @@
           <w:szCs w:val="28"/>
           <w:lang w:val="en-US"/>
         </w:rPr>
-        <w:t>{{document.field}}</w:t>
+        <w:t>{{document.fullDocumentCode2}</w:t>
       </w:r>
       <w:r>
         <w:rPr>

</xml_diff>